<commit_message>
Redraft user manual for bin-directed picking + Go button
Adds §3.5 Bin-directed picking and §4.3 Inventory, updates scan
guidance to the → button, documents the Bin Inventory import dataset
and bin-picking settings, plus new FAQ and glossary entries. 15 figures.

Co-Authored-By: Claude Opus 4.8 <noreply@anthropic.com>
</commit_message>
<xml_diff>
--- a/docs/WMSLite-User-Manual.docx
+++ b/docs/WMSLite-User-Manual.docx
@@ -106,7 +106,7 @@
           <w:i w:val="0"/>
           <w:color w:val="6B7280"/>
         </w:rPr>
-        <w:t>Version 1.0  ·  2026-06-24</w:t>
+        <w:t>Version 1.1  ·  2026-06-25</w:t>
       </w:r>
     </w:p>
     <w:p>
@@ -121,6 +121,21 @@
           <w:sz w:val="20"/>
         </w:rPr>
         <w:t>Operator (handheld) + Supervisor (console) edition</w:t>
+      </w:r>
+    </w:p>
+    <w:p/>
+    <w:p>
+      <w:pPr>
+        <w:jc w:val="center"/>
+      </w:pPr>
+      <w:r>
+        <w:rPr>
+          <w:b w:val="0"/>
+          <w:i/>
+          <w:color w:val="6B7280"/>
+          <w:sz w:val="18"/>
+        </w:rPr>
+        <w:t>What's new in 1.1: bin-directed picking (load a truck bin-by-bin), the Bin Inventory view and upload, and a clearer scan box with a Go (→) button.</w:t>
       </w:r>
     </w:p>
     <w:p>
@@ -208,6 +223,42 @@
         <w:rPr>
           <w:color w:val="15161B"/>
         </w:rPr>
+        <w:t>Two ways to load</w:t>
+      </w:r>
+    </w:p>
+    <w:p>
+      <w:r>
+        <w:rPr>
+          <w:b w:val="0"/>
+          <w:i w:val="0"/>
+        </w:rPr>
+        <w:t>Depending on how your site is set up, the handheld guides loading in one of two ways:</w:t>
+      </w:r>
+    </w:p>
+    <w:p>
+      <w:pPr>
+        <w:pStyle w:val="ListBullet"/>
+      </w:pPr>
+      <w:r>
+        <w:t>Standard loading — scan any coil on the plan, in any order, and confirm it.</w:t>
+      </w:r>
+    </w:p>
+    <w:p>
+      <w:pPr>
+        <w:pStyle w:val="ListBullet"/>
+      </w:pPr>
+      <w:r>
+        <w:t>Bin-directed picking — the app lists the bins to visit; you go to each bin, scan the bin, then scan the coils stored there. This is used when coil bin locations are available (see Section 3.5).</w:t>
+      </w:r>
+    </w:p>
+    <w:p>
+      <w:pPr>
+        <w:pStyle w:val="Heading2"/>
+      </w:pPr>
+      <w:r>
+        <w:rPr>
+          <w:color w:val="15161B"/>
+        </w:rPr>
         <w:t>Two apps, two roles</w:t>
       </w:r>
     </w:p>
@@ -224,7 +275,7 @@
         <w:pStyle w:val="ListBullet"/>
       </w:pPr>
       <w:r>
-        <w:t>Loading Supervisor — uses the back-office console (/wms-console) to monitor progress, approve exceptions, import plans, and watch the SAP integration.</w:t>
+        <w:t>Loading Supervisor — uses the back-office console (/wms-console) to monitor progress, approve exceptions, import plans and bin inventory, view stock locations, and watch the SAP integration.</w:t>
       </w:r>
     </w:p>
     <w:p>
@@ -259,7 +310,7 @@
         <w:pStyle w:val="ListBullet"/>
       </w:pPr>
       <w:r>
-        <w:t>Operators use a Zebra / DataWedge handheld scanner. Scanning a barcode types the value into the focused field and submits it automatically — loading is hands-free.</w:t>
+        <w:t>Operators use a Zebra / DataWedge handheld scanner. Scanning a barcode types the value into the focused field and opens the next step automatically — loading is hands-free.</w:t>
       </w:r>
     </w:p>
     <w:p>
@@ -267,7 +318,7 @@
         <w:pStyle w:val="ListBullet"/>
       </w:pPr>
       <w:r>
-        <w:t>You can also use any phone or tablet browser: tap a field, type the value, and press the keyboard's Go / Done key.</w:t>
+        <w:t>You can also use any phone or tablet browser: tap a field, type the value, and tap the orange Go (→) button next to the box (or press the keyboard's Go key).</w:t>
       </w:r>
     </w:p>
     <w:p>
@@ -276,6 +327,17 @@
       </w:pPr>
       <w:r>
         <w:t>Supervisors use the console in any desktop browser.</w:t>
+      </w:r>
+    </w:p>
+    <w:p>
+      <w:r>
+        <w:rPr>
+          <w:b w:val="0"/>
+          <w:i/>
+          <w:color w:val="6B7280"/>
+          <w:sz w:val="20"/>
+        </w:rPr>
+        <w:t>Tip: the Go (→) button beside every scan box always works, on every phone — use it if your keyboard's return key doesn't submit.</w:t>
       </w:r>
     </w:p>
     <w:p>
@@ -399,7 +461,7 @@
         <w:pStyle w:val="ListBullet"/>
       </w:pPr>
       <w:r>
-        <w:t>Scan box — scan or type a truck number to jump straight in.</w:t>
+        <w:t>Scan box — scan or type a truck number (then tap →) to jump straight in.</w:t>
       </w:r>
     </w:p>
     <w:p>
@@ -433,7 +495,7 @@
       <w:r>
         <w:drawing>
           <wp:inline xmlns:a="http://schemas.openxmlformats.org/drawingml/2006/main" xmlns:pic="http://schemas.openxmlformats.org/drawingml/2006/picture">
-            <wp:extent cx="2286000" cy="5456153"/>
+            <wp:extent cx="2286000" cy="4947138"/>
             <wp:docPr id="3" name="Picture 3"/>
             <wp:cNvGraphicFramePr>
               <a:graphicFrameLocks noChangeAspect="1"/>
@@ -454,7 +516,7 @@
                   <pic:spPr>
                     <a:xfrm>
                       <a:off x="0" y="0"/>
-                      <a:ext cx="2286000" cy="5456153"/>
+                      <a:ext cx="2286000" cy="4947138"/>
                     </a:xfrm>
                     <a:prstGeom prst="rect"/>
                   </pic:spPr>
@@ -475,7 +537,7 @@
           <w:color w:val="6B7280"/>
           <w:sz w:val="18"/>
         </w:rPr>
-        <w:t>Figure 2 — Operator Home: stats, scan box, To Load and Loaded Today lists.</w:t>
+        <w:t>Figure 2 — Operator Home: stats, scan box with the Go button, To Load and Loaded Today lists.</w:t>
       </w:r>
     </w:p>
     <w:p>
@@ -503,7 +565,7 @@
         <w:pStyle w:val="ListBullet"/>
       </w:pPr>
       <w:r>
-        <w:t>Scan the truck barcode (or type the number and press Go) in the scan box.</w:t>
+        <w:t>Scan the truck barcode (or type the number and tap →) in the scan box.</w:t>
       </w:r>
     </w:p>
     <w:p>
@@ -550,7 +612,7 @@
       <w:r>
         <w:drawing>
           <wp:inline xmlns:a="http://schemas.openxmlformats.org/drawingml/2006/main" xmlns:pic="http://schemas.openxmlformats.org/drawingml/2006/picture">
-            <wp:extent cx="2286000" cy="4955908"/>
+            <wp:extent cx="2286000" cy="4947138"/>
             <wp:docPr id="4" name="Picture 4"/>
             <wp:cNvGraphicFramePr>
               <a:graphicFrameLocks noChangeAspect="1"/>
@@ -571,7 +633,7 @@
                   <pic:spPr>
                     <a:xfrm>
                       <a:off x="0" y="0"/>
-                      <a:ext cx="2286000" cy="4955908"/>
+                      <a:ext cx="2286000" cy="4947138"/>
                     </a:xfrm>
                     <a:prstGeom prst="rect"/>
                   </pic:spPr>
@@ -592,7 +654,7 @@
           <w:color w:val="6B7280"/>
           <w:sz w:val="18"/>
         </w:rPr>
-        <w:t>Figure 3 — Loading screen: progress, scan box, and coil list.</w:t>
+        <w:t>Figure 3 — Loading screen: progress, scan box with Go button, and coil list.</w:t>
       </w:r>
     </w:p>
     <w:p>
@@ -611,7 +673,7 @@
         <w:pStyle w:val="ListNumber"/>
       </w:pPr>
       <w:r>
-        <w:t>Scan the coil's QR (or type its code and press Go).</w:t>
+        <w:t>Scan the coil's QR — or type its code and tap the Go (→) button.</w:t>
       </w:r>
     </w:p>
     <w:p>
@@ -645,7 +707,7 @@
       <w:r>
         <w:drawing>
           <wp:inline xmlns:a="http://schemas.openxmlformats.org/drawingml/2006/main" xmlns:pic="http://schemas.openxmlformats.org/drawingml/2006/picture">
-            <wp:extent cx="2286000" cy="5008260"/>
+            <wp:extent cx="2286000" cy="4947138"/>
             <wp:docPr id="5" name="Picture 5"/>
             <wp:cNvGraphicFramePr>
               <a:graphicFrameLocks noChangeAspect="1"/>
@@ -666,7 +728,7 @@
                   <pic:spPr>
                     <a:xfrm>
                       <a:off x="0" y="0"/>
-                      <a:ext cx="2286000" cy="5008260"/>
+                      <a:ext cx="2286000" cy="4947138"/>
                     </a:xfrm>
                     <a:prstGeom prst="rect"/>
                   </pic:spPr>
@@ -707,7 +769,190 @@
         <w:rPr>
           <w:color w:val="15161B"/>
         </w:rPr>
-        <w:t>3.5 Exceptions while scanning</w:t>
+        <w:t>3.5 Bin-directed picking</w:t>
+      </w:r>
+    </w:p>
+    <w:p>
+      <w:r>
+        <w:rPr>
+          <w:b w:val="0"/>
+          <w:i w:val="0"/>
+        </w:rPr>
+        <w:t>If your site supplies bin locations for coils, opening a truck shows a 'bins to visit' list instead of a flat coil list. You work the truck one bin at a time, which keeps walking to a minimum.</w:t>
+      </w:r>
+    </w:p>
+    <w:p>
+      <w:r>
+        <w:rPr>
+          <w:b w:val="0"/>
+          <w:i w:val="0"/>
+        </w:rPr>
+        <w:t>On the bins screen each card is a bin that still has coils to pick, sorted by zone and aisle, with a count of how many coils to pick there. Coils whose bin is not known are grouped at the bottom under 'Location unknown' — they are still pickable.</w:t>
+      </w:r>
+    </w:p>
+    <w:p>
+      <w:pPr>
+        <w:jc w:val="center"/>
+      </w:pPr>
+      <w:r>
+        <w:drawing>
+          <wp:inline xmlns:a="http://schemas.openxmlformats.org/drawingml/2006/main" xmlns:pic="http://schemas.openxmlformats.org/drawingml/2006/picture">
+            <wp:extent cx="2286000" cy="4947138"/>
+            <wp:docPr id="6" name="Picture 6"/>
+            <wp:cNvGraphicFramePr>
+              <a:graphicFrameLocks noChangeAspect="1"/>
+            </wp:cNvGraphicFramePr>
+            <a:graphic>
+              <a:graphicData uri="http://schemas.openxmlformats.org/drawingml/2006/picture">
+                <pic:pic>
+                  <pic:nvPicPr>
+                    <pic:cNvPr id="0" name="13-bins-to-visit.png"/>
+                    <pic:cNvPicPr/>
+                  </pic:nvPicPr>
+                  <pic:blipFill>
+                    <a:blip r:embed="rId14"/>
+                    <a:stretch>
+                      <a:fillRect/>
+                    </a:stretch>
+                  </pic:blipFill>
+                  <pic:spPr>
+                    <a:xfrm>
+                      <a:off x="0" y="0"/>
+                      <a:ext cx="2286000" cy="4947138"/>
+                    </a:xfrm>
+                    <a:prstGeom prst="rect"/>
+                  </pic:spPr>
+                </pic:pic>
+              </a:graphicData>
+            </a:graphic>
+          </wp:inline>
+        </w:drawing>
+      </w:r>
+    </w:p>
+    <w:p>
+      <w:pPr>
+        <w:jc w:val="center"/>
+      </w:pPr>
+      <w:r>
+        <w:rPr>
+          <w:i/>
+          <w:color w:val="6B7280"/>
+          <w:sz w:val="18"/>
+        </w:rPr>
+        <w:t>Figure 5 — Bins to visit: each bin with its zone/aisle and a 'to pick' count; unknown locations grouped last.</w:t>
+      </w:r>
+    </w:p>
+    <w:p>
+      <w:r>
+        <w:rPr>
+          <w:b w:val="0"/>
+          <w:i w:val="0"/>
+        </w:rPr>
+        <w:t>To pick a bin:</w:t>
+      </w:r>
+    </w:p>
+    <w:p>
+      <w:pPr>
+        <w:pStyle w:val="ListNumber"/>
+      </w:pPr>
+      <w:r>
+        <w:t>Walk to the bin. Scan the bin's code — or type it and tap → (or just tap the bin card).</w:t>
+      </w:r>
+    </w:p>
+    <w:p>
+      <w:pPr>
+        <w:pStyle w:val="ListNumber"/>
+      </w:pPr>
+      <w:r>
+        <w:t>The bin opens and lists only the coils to pick from it. The orange header shows the bin and its zone/aisle, with a ‹ Bins button to go back.</w:t>
+      </w:r>
+    </w:p>
+    <w:p>
+      <w:pPr>
+        <w:pStyle w:val="ListNumber"/>
+      </w:pPr>
+      <w:r>
+        <w:t>Scan each coil's QR (or type and tap →), then tap Confirm Coil Load — exactly as in standard loading.</w:t>
+      </w:r>
+    </w:p>
+    <w:p>
+      <w:pPr>
+        <w:pStyle w:val="ListNumber"/>
+      </w:pPr>
+      <w:r>
+        <w:t>When the bin's coils are all picked, the app returns to the bins list so you can go to the next bin.</w:t>
+      </w:r>
+    </w:p>
+    <w:p>
+      <w:pPr>
+        <w:jc w:val="center"/>
+      </w:pPr>
+      <w:r>
+        <w:drawing>
+          <wp:inline xmlns:a="http://schemas.openxmlformats.org/drawingml/2006/main" xmlns:pic="http://schemas.openxmlformats.org/drawingml/2006/picture">
+            <wp:extent cx="2286000" cy="4947138"/>
+            <wp:docPr id="7" name="Picture 7"/>
+            <wp:cNvGraphicFramePr>
+              <a:graphicFrameLocks noChangeAspect="1"/>
+            </wp:cNvGraphicFramePr>
+            <a:graphic>
+              <a:graphicData uri="http://schemas.openxmlformats.org/drawingml/2006/picture">
+                <pic:pic>
+                  <pic:nvPicPr>
+                    <pic:cNvPr id="0" name="14-bin-opened.png"/>
+                    <pic:cNvPicPr/>
+                  </pic:nvPicPr>
+                  <pic:blipFill>
+                    <a:blip r:embed="rId15"/>
+                    <a:stretch>
+                      <a:fillRect/>
+                    </a:stretch>
+                  </pic:blipFill>
+                  <pic:spPr>
+                    <a:xfrm>
+                      <a:off x="0" y="0"/>
+                      <a:ext cx="2286000" cy="4947138"/>
+                    </a:xfrm>
+                    <a:prstGeom prst="rect"/>
+                  </pic:spPr>
+                </pic:pic>
+              </a:graphicData>
+            </a:graphic>
+          </wp:inline>
+        </w:drawing>
+      </w:r>
+    </w:p>
+    <w:p>
+      <w:pPr>
+        <w:jc w:val="center"/>
+      </w:pPr>
+      <w:r>
+        <w:rPr>
+          <w:i/>
+          <w:color w:val="6B7280"/>
+          <w:sz w:val="18"/>
+        </w:rPr>
+        <w:t>Figure 6 — Inside a bin: the bin header, scan box, and only the coils stored in that bin.</w:t>
+      </w:r>
+    </w:p>
+    <w:p>
+      <w:r>
+        <w:rPr>
+          <w:b w:val="0"/>
+          <w:i w:val="0"/>
+        </w:rPr>
+        <w:t>Wrong bin? If you scan a coil that belongs to a different bin, the app warns you (for example, 'Coil belongs to bin B-03-01 — not this bin') and does not load it, so coils are picked from the correct location.</w:t>
+      </w:r>
+    </w:p>
+    <w:p>
+      <w:pPr>
+        <w:pStyle w:val="Heading2"/>
+      </w:pPr>
+      <w:r>
+        <w:rPr>
+          <w:color w:val="15161B"/>
+        </w:rPr>
+        <w:t>3.6 Exceptions while scanning</w:t>
       </w:r>
     </w:p>
     <w:p>
@@ -731,6 +976,14 @@
         <w:pStyle w:val="ListBullet"/>
       </w:pPr>
       <w:r>
+        <w:t>Wrong bin (bin-directed picking) — the coil is on the truck but stored in another bin; go to that bin to pick it.</w:t>
+      </w:r>
+    </w:p>
+    <w:p>
+      <w:pPr>
+        <w:pStyle w:val="ListBullet"/>
+      </w:pPr>
+      <w:r>
         <w:t>Over-scan (coil not in the SAP plan) — if your site allows it, an amber 'Add &amp; Load' panel lets you load it anyway; it is recorded as an unplanned load for the supervisor to see.</w:t>
       </w:r>
     </w:p>
@@ -742,7 +995,7 @@
         <w:rPr>
           <w:color w:val="15161B"/>
         </w:rPr>
-        <w:t>3.6 Completing the truck</w:t>
+        <w:t>3.7 Completing the truck</w:t>
       </w:r>
     </w:p>
     <w:p>
@@ -771,7 +1024,7 @@
         <w:drawing>
           <wp:inline xmlns:a="http://schemas.openxmlformats.org/drawingml/2006/main" xmlns:pic="http://schemas.openxmlformats.org/drawingml/2006/picture">
             <wp:extent cx="2286000" cy="4955908"/>
-            <wp:docPr id="6" name="Picture 6"/>
+            <wp:docPr id="8" name="Picture 8"/>
             <wp:cNvGraphicFramePr>
               <a:graphicFrameLocks noChangeAspect="1"/>
             </wp:cNvGraphicFramePr>
@@ -783,7 +1036,7 @@
                     <pic:cNvPicPr/>
                   </pic:nvPicPr>
                   <pic:blipFill>
-                    <a:blip r:embed="rId14"/>
+                    <a:blip r:embed="rId16"/>
                     <a:stretch>
                       <a:fillRect/>
                     </a:stretch>
@@ -812,7 +1065,7 @@
           <w:color w:val="6B7280"/>
           <w:sz w:val="18"/>
         </w:rPr>
-        <w:t>Figure 5 — Short-load: give a reason for each coil not loaded; a supervisor approves.</w:t>
+        <w:t>Figure 7 — Short-load: give a reason for each coil not loaded; a supervisor approves.</w:t>
       </w:r>
     </w:p>
     <w:p>
@@ -823,7 +1076,7 @@
         <w:rPr>
           <w:color w:val="15161B"/>
         </w:rPr>
-        <w:t>3.7 Reviewing a loaded truck</w:t>
+        <w:t>3.8 Reviewing a loaded truck</w:t>
       </w:r>
     </w:p>
     <w:p>
@@ -843,7 +1096,7 @@
         <w:drawing>
           <wp:inline xmlns:a="http://schemas.openxmlformats.org/drawingml/2006/main" xmlns:pic="http://schemas.openxmlformats.org/drawingml/2006/picture">
             <wp:extent cx="2286000" cy="4955908"/>
-            <wp:docPr id="7" name="Picture 7"/>
+            <wp:docPr id="9" name="Picture 9"/>
             <wp:cNvGraphicFramePr>
               <a:graphicFrameLocks noChangeAspect="1"/>
             </wp:cNvGraphicFramePr>
@@ -855,7 +1108,7 @@
                     <pic:cNvPicPr/>
                   </pic:nvPicPr>
                   <pic:blipFill>
-                    <a:blip r:embed="rId15"/>
+                    <a:blip r:embed="rId17"/>
                     <a:stretch>
                       <a:fillRect/>
                     </a:stretch>
@@ -884,7 +1137,7 @@
           <w:color w:val="6B7280"/>
           <w:sz w:val="18"/>
         </w:rPr>
-        <w:t>Figure 6 — Read-only summary of a completed truck.</w:t>
+        <w:t>Figure 8 — Read-only summary of a completed truck.</w:t>
       </w:r>
     </w:p>
     <w:p>
@@ -895,7 +1148,7 @@
         <w:rPr>
           <w:color w:val="15161B"/>
         </w:rPr>
-        <w:t>3.8 Working offline</w:t>
+        <w:t>3.9 Working offline</w:t>
       </w:r>
     </w:p>
     <w:p>
@@ -967,7 +1220,7 @@
         <w:drawing>
           <wp:inline xmlns:a="http://schemas.openxmlformats.org/drawingml/2006/main" xmlns:pic="http://schemas.openxmlformats.org/drawingml/2006/picture">
             <wp:extent cx="5760720" cy="3795496"/>
-            <wp:docPr id="8" name="Picture 8"/>
+            <wp:docPr id="10" name="Picture 10"/>
             <wp:cNvGraphicFramePr>
               <a:graphicFrameLocks noChangeAspect="1"/>
             </wp:cNvGraphicFramePr>
@@ -976,130 +1229,6 @@
                 <pic:pic>
                   <pic:nvPicPr>
                     <pic:cNvPr id="0" name="07-console-dashboard.png"/>
-                    <pic:cNvPicPr/>
-                  </pic:nvPicPr>
-                  <pic:blipFill>
-                    <a:blip r:embed="rId16"/>
-                    <a:stretch>
-                      <a:fillRect/>
-                    </a:stretch>
-                  </pic:blipFill>
-                  <pic:spPr>
-                    <a:xfrm>
-                      <a:off x="0" y="0"/>
-                      <a:ext cx="5760720" cy="3795496"/>
-                    </a:xfrm>
-                    <a:prstGeom prst="rect"/>
-                  </pic:spPr>
-                </pic:pic>
-              </a:graphicData>
-            </a:graphic>
-          </wp:inline>
-        </w:drawing>
-      </w:r>
-    </w:p>
-    <w:p>
-      <w:pPr>
-        <w:jc w:val="center"/>
-      </w:pPr>
-      <w:r>
-        <w:rPr>
-          <w:i/>
-          <w:color w:val="6B7280"/>
-          <w:sz w:val="18"/>
-        </w:rPr>
-        <w:t>Figure 7 — Console dashboard with date range, live and throughput tiles.</w:t>
-      </w:r>
-    </w:p>
-    <w:p>
-      <w:pPr>
-        <w:pStyle w:val="Heading2"/>
-      </w:pPr>
-      <w:r>
-        <w:rPr>
-          <w:color w:val="15161B"/>
-        </w:rPr>
-        <w:t>4.2 Trucks &amp; drill-down</w:t>
-      </w:r>
-    </w:p>
-    <w:p>
-      <w:r>
-        <w:rPr>
-          <w:b w:val="0"/>
-          <w:i w:val="0"/>
-        </w:rPr>
-        <w:t>The Trucks page lists every loading plan with status, GI status and progress; filter by status, search, or date range. Click a truck to open its drawer — coils with who/when, the full event history, and Cancel / Reopen actions.</w:t>
-      </w:r>
-    </w:p>
-    <w:p>
-      <w:pPr>
-        <w:jc w:val="center"/>
-      </w:pPr>
-      <w:r>
-        <w:drawing>
-          <wp:inline xmlns:a="http://schemas.openxmlformats.org/drawingml/2006/main" xmlns:pic="http://schemas.openxmlformats.org/drawingml/2006/picture">
-            <wp:extent cx="5760720" cy="3795496"/>
-            <wp:docPr id="9" name="Picture 9"/>
-            <wp:cNvGraphicFramePr>
-              <a:graphicFrameLocks noChangeAspect="1"/>
-            </wp:cNvGraphicFramePr>
-            <a:graphic>
-              <a:graphicData uri="http://schemas.openxmlformats.org/drawingml/2006/picture">
-                <pic:pic>
-                  <pic:nvPicPr>
-                    <pic:cNvPr id="0" name="08-console-trucks.png"/>
-                    <pic:cNvPicPr/>
-                  </pic:nvPicPr>
-                  <pic:blipFill>
-                    <a:blip r:embed="rId17"/>
-                    <a:stretch>
-                      <a:fillRect/>
-                    </a:stretch>
-                  </pic:blipFill>
-                  <pic:spPr>
-                    <a:xfrm>
-                      <a:off x="0" y="0"/>
-                      <a:ext cx="5760720" cy="3795496"/>
-                    </a:xfrm>
-                    <a:prstGeom prst="rect"/>
-                  </pic:spPr>
-                </pic:pic>
-              </a:graphicData>
-            </a:graphic>
-          </wp:inline>
-        </w:drawing>
-      </w:r>
-    </w:p>
-    <w:p>
-      <w:pPr>
-        <w:jc w:val="center"/>
-      </w:pPr>
-      <w:r>
-        <w:rPr>
-          <w:i/>
-          <w:color w:val="6B7280"/>
-          <w:sz w:val="18"/>
-        </w:rPr>
-        <w:t>Figure 8 — Trucks list with status, GI and progress columns.</w:t>
-      </w:r>
-    </w:p>
-    <w:p>
-      <w:pPr>
-        <w:jc w:val="center"/>
-      </w:pPr>
-      <w:r>
-        <w:drawing>
-          <wp:inline xmlns:a="http://schemas.openxmlformats.org/drawingml/2006/main" xmlns:pic="http://schemas.openxmlformats.org/drawingml/2006/picture">
-            <wp:extent cx="5760720" cy="3795496"/>
-            <wp:docPr id="10" name="Picture 10"/>
-            <wp:cNvGraphicFramePr>
-              <a:graphicFrameLocks noChangeAspect="1"/>
-            </wp:cNvGraphicFramePr>
-            <a:graphic>
-              <a:graphicData uri="http://schemas.openxmlformats.org/drawingml/2006/picture">
-                <pic:pic>
-                  <pic:nvPicPr>
-                    <pic:cNvPr id="0" name="09-console-truck-drawer.png"/>
                     <pic:cNvPicPr/>
                   </pic:nvPicPr>
                   <pic:blipFill>
@@ -1132,7 +1261,7 @@
           <w:color w:val="6B7280"/>
           <w:sz w:val="18"/>
         </w:rPr>
-        <w:t>Figure 9 — Truck drill-down: coils and the event audit trail.</w:t>
+        <w:t>Figure 9 — Console dashboard with date range, live and throughput tiles.</w:t>
       </w:r>
     </w:p>
     <w:p>
@@ -1143,7 +1272,203 @@
         <w:rPr>
           <w:color w:val="15161B"/>
         </w:rPr>
-        <w:t>4.3 SAP Confirmations (goods issue)</w:t>
+        <w:t>4.2 Trucks &amp; drill-down</w:t>
+      </w:r>
+    </w:p>
+    <w:p>
+      <w:r>
+        <w:rPr>
+          <w:b w:val="0"/>
+          <w:i w:val="0"/>
+        </w:rPr>
+        <w:t>The Trucks page lists every loading plan with status, GI status and progress; filter by status, search, or date range. Click a truck to open its drawer — coils with who/when, the full event history, and Cancel / Reopen actions.</w:t>
+      </w:r>
+    </w:p>
+    <w:p>
+      <w:pPr>
+        <w:jc w:val="center"/>
+      </w:pPr>
+      <w:r>
+        <w:drawing>
+          <wp:inline xmlns:a="http://schemas.openxmlformats.org/drawingml/2006/main" xmlns:pic="http://schemas.openxmlformats.org/drawingml/2006/picture">
+            <wp:extent cx="5760720" cy="3795496"/>
+            <wp:docPr id="11" name="Picture 11"/>
+            <wp:cNvGraphicFramePr>
+              <a:graphicFrameLocks noChangeAspect="1"/>
+            </wp:cNvGraphicFramePr>
+            <a:graphic>
+              <a:graphicData uri="http://schemas.openxmlformats.org/drawingml/2006/picture">
+                <pic:pic>
+                  <pic:nvPicPr>
+                    <pic:cNvPr id="0" name="08-console-trucks.png"/>
+                    <pic:cNvPicPr/>
+                  </pic:nvPicPr>
+                  <pic:blipFill>
+                    <a:blip r:embed="rId19"/>
+                    <a:stretch>
+                      <a:fillRect/>
+                    </a:stretch>
+                  </pic:blipFill>
+                  <pic:spPr>
+                    <a:xfrm>
+                      <a:off x="0" y="0"/>
+                      <a:ext cx="5760720" cy="3795496"/>
+                    </a:xfrm>
+                    <a:prstGeom prst="rect"/>
+                  </pic:spPr>
+                </pic:pic>
+              </a:graphicData>
+            </a:graphic>
+          </wp:inline>
+        </w:drawing>
+      </w:r>
+    </w:p>
+    <w:p>
+      <w:pPr>
+        <w:jc w:val="center"/>
+      </w:pPr>
+      <w:r>
+        <w:rPr>
+          <w:i/>
+          <w:color w:val="6B7280"/>
+          <w:sz w:val="18"/>
+        </w:rPr>
+        <w:t>Figure 10 — Trucks list with status, GI and progress columns.</w:t>
+      </w:r>
+    </w:p>
+    <w:p>
+      <w:pPr>
+        <w:jc w:val="center"/>
+      </w:pPr>
+      <w:r>
+        <w:drawing>
+          <wp:inline xmlns:a="http://schemas.openxmlformats.org/drawingml/2006/main" xmlns:pic="http://schemas.openxmlformats.org/drawingml/2006/picture">
+            <wp:extent cx="5760720" cy="3795496"/>
+            <wp:docPr id="12" name="Picture 12"/>
+            <wp:cNvGraphicFramePr>
+              <a:graphicFrameLocks noChangeAspect="1"/>
+            </wp:cNvGraphicFramePr>
+            <a:graphic>
+              <a:graphicData uri="http://schemas.openxmlformats.org/drawingml/2006/picture">
+                <pic:pic>
+                  <pic:nvPicPr>
+                    <pic:cNvPr id="0" name="09-console-truck-drawer.png"/>
+                    <pic:cNvPicPr/>
+                  </pic:nvPicPr>
+                  <pic:blipFill>
+                    <a:blip r:embed="rId20"/>
+                    <a:stretch>
+                      <a:fillRect/>
+                    </a:stretch>
+                  </pic:blipFill>
+                  <pic:spPr>
+                    <a:xfrm>
+                      <a:off x="0" y="0"/>
+                      <a:ext cx="5760720" cy="3795496"/>
+                    </a:xfrm>
+                    <a:prstGeom prst="rect"/>
+                  </pic:spPr>
+                </pic:pic>
+              </a:graphicData>
+            </a:graphic>
+          </wp:inline>
+        </w:drawing>
+      </w:r>
+    </w:p>
+    <w:p>
+      <w:pPr>
+        <w:jc w:val="center"/>
+      </w:pPr>
+      <w:r>
+        <w:rPr>
+          <w:i/>
+          <w:color w:val="6B7280"/>
+          <w:sz w:val="18"/>
+        </w:rPr>
+        <w:t>Figure 11 — Truck drill-down: coils and the event audit trail.</w:t>
+      </w:r>
+    </w:p>
+    <w:p>
+      <w:pPr>
+        <w:pStyle w:val="Heading2"/>
+      </w:pPr>
+      <w:r>
+        <w:rPr>
+          <w:color w:val="15161B"/>
+        </w:rPr>
+        <w:t>4.3 Inventory (bin locations)</w:t>
+      </w:r>
+    </w:p>
+    <w:p>
+      <w:r>
+        <w:rPr>
+          <w:b w:val="0"/>
+          <w:i w:val="0"/>
+        </w:rPr>
+        <w:t>The Inventory view shows where coils are stored — one row per coil with its bin, grade, weight, zone/aisle, status (Available / Picked / Blocked) and source (Push API / Upload / In-app). Search by coil or bin and filter by status. Operators use these locations during bin-directed picking; when a coil is loaded, its row is marked Picked.</w:t>
+      </w:r>
+    </w:p>
+    <w:p>
+      <w:pPr>
+        <w:jc w:val="center"/>
+      </w:pPr>
+      <w:r>
+        <w:drawing>
+          <wp:inline xmlns:a="http://schemas.openxmlformats.org/drawingml/2006/main" xmlns:pic="http://schemas.openxmlformats.org/drawingml/2006/picture">
+            <wp:extent cx="5760720" cy="3988191"/>
+            <wp:docPr id="13" name="Picture 13"/>
+            <wp:cNvGraphicFramePr>
+              <a:graphicFrameLocks noChangeAspect="1"/>
+            </wp:cNvGraphicFramePr>
+            <a:graphic>
+              <a:graphicData uri="http://schemas.openxmlformats.org/drawingml/2006/picture">
+                <pic:pic>
+                  <pic:nvPicPr>
+                    <pic:cNvPr id="0" name="15-console-inventory.png"/>
+                    <pic:cNvPicPr/>
+                  </pic:nvPicPr>
+                  <pic:blipFill>
+                    <a:blip r:embed="rId21"/>
+                    <a:stretch>
+                      <a:fillRect/>
+                    </a:stretch>
+                  </pic:blipFill>
+                  <pic:spPr>
+                    <a:xfrm>
+                      <a:off x="0" y="0"/>
+                      <a:ext cx="5760720" cy="3988191"/>
+                    </a:xfrm>
+                    <a:prstGeom prst="rect"/>
+                  </pic:spPr>
+                </pic:pic>
+              </a:graphicData>
+            </a:graphic>
+          </wp:inline>
+        </w:drawing>
+      </w:r>
+    </w:p>
+    <w:p>
+      <w:pPr>
+        <w:jc w:val="center"/>
+      </w:pPr>
+      <w:r>
+        <w:rPr>
+          <w:i/>
+          <w:color w:val="6B7280"/>
+          <w:sz w:val="18"/>
+        </w:rPr>
+        <w:t>Figure 12 — Inventory: coil-to-bin locations with status and source.</w:t>
+      </w:r>
+    </w:p>
+    <w:p>
+      <w:pPr>
+        <w:pStyle w:val="Heading2"/>
+      </w:pPr>
+      <w:r>
+        <w:rPr>
+          <w:color w:val="15161B"/>
+        </w:rPr>
+        <w:t>4.4 SAP Confirmations (goods issue)</w:t>
       </w:r>
     </w:p>
     <w:p>
@@ -1179,7 +1504,7 @@
         <w:drawing>
           <wp:inline xmlns:a="http://schemas.openxmlformats.org/drawingml/2006/main" xmlns:pic="http://schemas.openxmlformats.org/drawingml/2006/picture">
             <wp:extent cx="5760720" cy="3795496"/>
-            <wp:docPr id="11" name="Picture 11"/>
+            <wp:docPr id="14" name="Picture 14"/>
             <wp:cNvGraphicFramePr>
               <a:graphicFrameLocks noChangeAspect="1"/>
             </wp:cNvGraphicFramePr>
@@ -1191,7 +1516,7 @@
                     <pic:cNvPicPr/>
                   </pic:nvPicPr>
                   <pic:blipFill>
-                    <a:blip r:embed="rId19"/>
+                    <a:blip r:embed="rId22"/>
                     <a:stretch>
                       <a:fillRect/>
                     </a:stretch>
@@ -1220,7 +1545,7 @@
           <w:color w:val="6B7280"/>
           <w:sz w:val="18"/>
         </w:rPr>
-        <w:t>Figure 10 — SAP Confirmations with Release / Retry actions.</w:t>
+        <w:t>Figure 13 — SAP Confirmations with Release / Retry actions.</w:t>
       </w:r>
     </w:p>
     <w:p>
@@ -1231,7 +1556,7 @@
         <w:rPr>
           <w:color w:val="15161B"/>
         </w:rPr>
-        <w:t>4.4 SAP Log</w:t>
+        <w:t>4.5 SAP Log</w:t>
       </w:r>
     </w:p>
     <w:p>
@@ -1251,7 +1576,7 @@
         <w:drawing>
           <wp:inline xmlns:a="http://schemas.openxmlformats.org/drawingml/2006/main" xmlns:pic="http://schemas.openxmlformats.org/drawingml/2006/picture">
             <wp:extent cx="5760720" cy="3795496"/>
-            <wp:docPr id="12" name="Picture 12"/>
+            <wp:docPr id="15" name="Picture 15"/>
             <wp:cNvGraphicFramePr>
               <a:graphicFrameLocks noChangeAspect="1"/>
             </wp:cNvGraphicFramePr>
@@ -1263,7 +1588,7 @@
                     <pic:cNvPicPr/>
                   </pic:nvPicPr>
                   <pic:blipFill>
-                    <a:blip r:embed="rId20"/>
+                    <a:blip r:embed="rId23"/>
                     <a:stretch>
                       <a:fillRect/>
                     </a:stretch>
@@ -1292,7 +1617,7 @@
           <w:color w:val="6B7280"/>
           <w:sz w:val="18"/>
         </w:rPr>
-        <w:t>Figure 11 — SAP Log (inbound + outbound).</w:t>
+        <w:t>Figure 14 — SAP Log (inbound + outbound).</w:t>
       </w:r>
     </w:p>
     <w:p>
@@ -1303,7 +1628,7 @@
         <w:rPr>
           <w:color w:val="15161B"/>
         </w:rPr>
-        <w:t>4.5 Importing loading plans (upload fallback)</w:t>
+        <w:t>4.6 Importing data (upload fallback)</w:t>
       </w:r>
     </w:p>
     <w:p>
@@ -1312,7 +1637,23 @@
           <w:b w:val="0"/>
           <w:i w:val="0"/>
         </w:rPr>
-        <w:t>If SAP is not pushing plans yet, you can upload them. Click Download template for a CSV with the correct columns (truck_number and coil_barcode are required; sap_plan_id, material_grade, weight are optional — one row per coil). Fill it in, upload, map the columns, preview, and commit.</w:t>
+        <w:t>If a feed is not pushing data yet, you can upload it. Pick the dataset, click Download template for a CSV with the correct columns, fill it in, upload, map the columns, preview, and commit. Two datasets are supported:</w:t>
+      </w:r>
+    </w:p>
+    <w:p>
+      <w:pPr>
+        <w:pStyle w:val="ListBullet"/>
+      </w:pPr>
+      <w:r>
+        <w:t>Loading Plan — one row per coil (truck_number and coil_barcode required; sap_plan_id, material_grade, weight optional).</w:t>
+      </w:r>
+    </w:p>
+    <w:p>
+      <w:pPr>
+        <w:pStyle w:val="ListBullet"/>
+      </w:pPr>
+      <w:r>
+        <w:t>Bin Inventory — one row per coil (coil_barcode and bin_code required; material_grade, weight, zone, aisle optional). Bin inventory is normally pushed in automatically; this upload is a fallback.</w:t>
       </w:r>
     </w:p>
     <w:p>
@@ -1322,8 +1663,8 @@
       <w:r>
         <w:drawing>
           <wp:inline xmlns:a="http://schemas.openxmlformats.org/drawingml/2006/main" xmlns:pic="http://schemas.openxmlformats.org/drawingml/2006/picture">
-            <wp:extent cx="5760720" cy="3795496"/>
-            <wp:docPr id="13" name="Picture 13"/>
+            <wp:extent cx="5760720" cy="3988191"/>
+            <wp:docPr id="16" name="Picture 16"/>
             <wp:cNvGraphicFramePr>
               <a:graphicFrameLocks noChangeAspect="1"/>
             </wp:cNvGraphicFramePr>
@@ -1335,7 +1676,7 @@
                     <pic:cNvPicPr/>
                   </pic:nvPicPr>
                   <pic:blipFill>
-                    <a:blip r:embed="rId21"/>
+                    <a:blip r:embed="rId24"/>
                     <a:stretch>
                       <a:fillRect/>
                     </a:stretch>
@@ -1343,7 +1684,7 @@
                   <pic:spPr>
                     <a:xfrm>
                       <a:off x="0" y="0"/>
-                      <a:ext cx="5760720" cy="3795496"/>
+                      <a:ext cx="5760720" cy="3988191"/>
                     </a:xfrm>
                     <a:prstGeom prst="rect"/>
                   </pic:spPr>
@@ -1364,7 +1705,7 @@
           <w:color w:val="6B7280"/>
           <w:sz w:val="18"/>
         </w:rPr>
-        <w:t>Figure 12 — Import: download the template, then upload a loading plan.</w:t>
+        <w:t>Figure 15 — Import: choose a dataset (Loading Plan or Bin Inventory), download the template, then upload.</w:t>
       </w:r>
     </w:p>
     <w:p>
@@ -1375,7 +1716,7 @@
         <w:rPr>
           <w:color w:val="15161B"/>
         </w:rPr>
-        <w:t>4.6 Settings overview</w:t>
+        <w:t>4.7 Settings overview</w:t>
       </w:r>
     </w:p>
     <w:p>
@@ -1385,6 +1726,15 @@
           <w:i w:val="0"/>
         </w:rPr>
         <w:t>WMSLite Settings (admin) controls the integration and floor rules: the SAP push API key, the coil QR decode rule, whether over-scan is allowed, the undo window, the supervisor approval PIN, and the outbound goods-issue connection (OAuth credentials + endpoint).</w:t>
+      </w:r>
+    </w:p>
+    <w:p>
+      <w:r>
+        <w:rPr>
+          <w:b w:val="0"/>
+          <w:i w:val="0"/>
+        </w:rPr>
+        <w:t>Bin picking has its own settings: turn bin-directed picking on or off, choose the bin-code decode rule, allow or block picking a coil from the wrong bin, and whether loading a coil marks its bin-inventory row Picked. When bin picking is off — or a truck has no bin locations — the handheld uses standard loading automatically.</w:t>
       </w:r>
     </w:p>
     <w:p>
@@ -1418,7 +1768,7 @@
           <w:b w:val="0"/>
           <w:i w:val="0"/>
         </w:rPr>
-        <w:t>Make sure the coil scan box is focused (tap it), then press the keyboard's Go/Done key after typing, or use the handheld scanner which submits automatically.</w:t>
+        <w:t>Tap the orange Go (→) button next to the scan box after typing. A handheld scanner opens the next step automatically; if it doesn't, the Go button always works.</w:t>
       </w:r>
     </w:p>
     <w:p>
@@ -1437,6 +1787,60 @@
           <w:i w:val="0"/>
         </w:rPr>
         <w:t>It belongs to a different truck's plan, or the code was misread — re-scan. If it genuinely must go on this truck and over-scan is enabled, use Add &amp; Load.</w:t>
+      </w:r>
+    </w:p>
+    <w:p>
+      <w:r>
+        <w:rPr>
+          <w:b/>
+          <w:i w:val="0"/>
+        </w:rPr>
+        <w:t>It says the coil belongs to another bin.</w:t>
+      </w:r>
+    </w:p>
+    <w:p>
+      <w:r>
+        <w:rPr>
+          <w:b w:val="0"/>
+          <w:i w:val="0"/>
+        </w:rPr>
+        <w:t>In bin-directed picking, each coil is picked from its own bin. Go back to the bins list (‹ Bins), open the bin named in the message, and scan the coil there.</w:t>
+      </w:r>
+    </w:p>
+    <w:p>
+      <w:r>
+        <w:rPr>
+          <w:b/>
+          <w:i w:val="0"/>
+        </w:rPr>
+        <w:t>I see a 'bins to visit' list instead of the coils.</w:t>
+      </w:r>
+    </w:p>
+    <w:p>
+      <w:r>
+        <w:rPr>
+          <w:b w:val="0"/>
+          <w:i w:val="0"/>
+        </w:rPr>
+        <w:t>That truck is being loaded bin-by-bin. Go to a bin, scan it (or tap it), then scan the coils it lists. See Section 3.5.</w:t>
+      </w:r>
+    </w:p>
+    <w:p>
+      <w:r>
+        <w:rPr>
+          <w:b/>
+          <w:i w:val="0"/>
+        </w:rPr>
+        <w:t>A coil shows under 'Location unknown'.</w:t>
+      </w:r>
+    </w:p>
+    <w:p>
+      <w:r>
+        <w:rPr>
+          <w:b w:val="0"/>
+          <w:i w:val="0"/>
+        </w:rPr>
+        <w:t>Its bin location wasn't supplied. You can still pick it — open the Location unknown group and scan the coil as usual.</w:t>
       </w:r>
     </w:p>
     <w:p>
@@ -1554,6 +1958,50 @@
         <w:rPr>
           <w:b/>
         </w:rPr>
+        <w:t xml:space="preserve">Bin — </w:t>
+      </w:r>
+      <w:r>
+        <w:t>A storage location where coils are kept, identified by a bin code (often with a zone and aisle).</w:t>
+      </w:r>
+    </w:p>
+    <w:p>
+      <w:r>
+        <w:rPr>
+          <w:b/>
+        </w:rPr>
+        <w:t xml:space="preserve">Bin-directed picking — </w:t>
+      </w:r>
+      <w:r>
+        <w:t>Loading a truck one bin at a time: visit the bin, scan it, then scan the coils stored there.</w:t>
+      </w:r>
+    </w:p>
+    <w:p>
+      <w:r>
+        <w:rPr>
+          <w:b/>
+        </w:rPr>
+        <w:t xml:space="preserve">Bin Inventory — </w:t>
+      </w:r>
+      <w:r>
+        <w:t>The list of which bin each coil is stored in; shown in the console Inventory view.</w:t>
+      </w:r>
+    </w:p>
+    <w:p>
+      <w:r>
+        <w:rPr>
+          <w:b/>
+        </w:rPr>
+        <w:t xml:space="preserve">Location unknown — </w:t>
+      </w:r>
+      <w:r>
+        <w:t>Coils on the plan whose bin location wasn't supplied; still pickable, grouped on their own.</w:t>
+      </w:r>
+    </w:p>
+    <w:p>
+      <w:r>
+        <w:rPr>
+          <w:b/>
+        </w:rPr>
         <w:t xml:space="preserve">Claim — </w:t>
       </w:r>
       <w:r>
@@ -1602,6 +2050,17 @@
       </w:r>
       <w:r>
         <w:t>A goods-issue confirmation waiting for a supervisor to release it.</w:t>
+      </w:r>
+    </w:p>
+    <w:p>
+      <w:r>
+        <w:rPr>
+          <w:b/>
+        </w:rPr>
+        <w:t xml:space="preserve">Picked — </w:t>
+      </w:r>
+      <w:r>
+        <w:t>A bin-inventory coil that has been loaded onto a truck.</w:t>
       </w:r>
     </w:p>
     <w:p>

</xml_diff>